<commit_message>
Deploying to gh-pages from @ Morrison-Lab/wai@765743ce7a01b8e5a901ecb49e1ed5551b1303b8 🚀
</commit_message>
<xml_diff>
--- a/chapters/pr-workflow-with-agents.docx
+++ b/chapters/pr-workflow-with-agents.docx
@@ -15,7 +15,7 @@
         <w:pStyle w:val="Date"/>
       </w:pPr>
       <w:r>
-        <w:t xml:space="preserve">Last modified: 2026-08-22 18:12:39 (PDT)</w:t>
+        <w:t xml:space="preserve">Last modified: 2026-08-22 18:13:52 (PDT)</w:t>
       </w:r>
     </w:p>
     <w:p>
@@ -29046,18 +29046,198 @@
       </w:r>
     </w:p>
     <w:bookmarkEnd w:id="44"/>
-    <w:bookmarkStart w:id="46" w:name="references"/>
+    <w:bookmarkStart w:id="46" w:name="sec-invalidate-ai-review"/>
     <w:p>
       <w:pPr>
         <w:pStyle w:val="Heading1"/>
       </w:pPr>
       <w:r>
+        <w:t xml:space="preserve">7. Reviewing AI-generated work</w:t>
+      </w:r>
+    </w:p>
+    <w:p>
+      <w:pPr>
+        <w:pStyle w:val="FirstParagraph"/>
+      </w:pPr>
+      <w:r>
+        <w:t xml:space="preserve">A reviewer of AI-generated work is not there to confirm that it sounds right.</w:t>
+      </w:r>
+      <w:r>
+        <w:t xml:space="preserve"> </w:t>
+      </w:r>
+      <w:r>
+        <w:t xml:space="preserve">The job is to</w:t>
+      </w:r>
+      <w:r>
+        <w:t xml:space="preserve"> </w:t>
+      </w:r>
+      <w:r>
+        <w:rPr>
+          <w:b/>
+          <w:bCs/>
+        </w:rPr>
+        <w:t xml:space="preserve">try to invalidate it</w:t>
+      </w:r>
+      <w:r>
+        <w:t xml:space="preserve">.</w:t>
+      </w:r>
+      <w:r>
+        <w:t xml:space="preserve"> </w:t>
+      </w:r>
+      <w:r>
+        <w:t xml:space="preserve">Assume the output is wrong until a check shows otherwise,</w:t>
+      </w:r>
+      <w:r>
+        <w:t xml:space="preserve"> </w:t>
+      </w:r>
+      <w:r>
+        <w:t xml:space="preserve">and search mercilessly for mistakes.</w:t>
+      </w:r>
+    </w:p>
+    <w:p>
+      <w:pPr>
+        <w:pStyle w:val="BodyText"/>
+      </w:pPr>
+      <w:r>
+        <w:t xml:space="preserve">Plausible, fluent prose is the main risk, not a comfort.</w:t>
+      </w:r>
+      <w:r>
+        <w:t xml:space="preserve"> </w:t>
+      </w:r>
+      <w:r>
+        <w:t xml:space="preserve">It conceals errors that a human’s awkward draft would have made obvious.</w:t>
+      </w:r>
+      <w:r>
+        <w:t xml:space="preserve"> </w:t>
+      </w:r>
+      <w:r>
+        <w:t xml:space="preserve">Put on the harshest critic hat, especially for:</w:t>
+      </w:r>
+    </w:p>
+    <w:p>
+      <w:pPr>
+        <w:pStyle w:val="Compact"/>
+        <w:numPr>
+          <w:ilvl w:val="0"/>
+          <w:numId w:val="1093"/>
+        </w:numPr>
+      </w:pPr>
+      <w:r>
+        <w:t xml:space="preserve">citations, DOIs, and URLs that may have been invented</w:t>
+      </w:r>
+    </w:p>
+    <w:p>
+      <w:pPr>
+        <w:pStyle w:val="Compact"/>
+        <w:numPr>
+          <w:ilvl w:val="0"/>
+          <w:numId w:val="1093"/>
+        </w:numPr>
+      </w:pPr>
+      <w:r>
+        <w:t xml:space="preserve">functions, flags, and APIs that may not exist on the version you actually run</w:t>
+      </w:r>
+    </w:p>
+    <w:p>
+      <w:pPr>
+        <w:pStyle w:val="Compact"/>
+        <w:numPr>
+          <w:ilvl w:val="0"/>
+          <w:numId w:val="1093"/>
+        </w:numPr>
+      </w:pPr>
+      <w:r>
+        <w:t xml:space="preserve">numbers, file paths, and</w:t>
+      </w:r>
+      <w:r>
+        <w:t xml:space="preserve"> </w:t>
+      </w:r>
+      <w:r>
+        <w:t xml:space="preserve">“as of”</w:t>
+      </w:r>
+      <w:r>
+        <w:t xml:space="preserve"> </w:t>
+      </w:r>
+      <w:r>
+        <w:t xml:space="preserve">claims that were never measured</w:t>
+      </w:r>
+    </w:p>
+    <w:p>
+      <w:pPr>
+        <w:pStyle w:val="FirstParagraph"/>
+      </w:pPr>
+      <w:r>
+        <w:t xml:space="preserve">Author-side validation</w:t>
+      </w:r>
+      <w:r>
+        <w:t xml:space="preserve"> </w:t>
+      </w:r>
+      <w:r>
+        <w:t xml:space="preserve">(</w:t>
+      </w:r>
+      <w:hyperlink r:id="rId45">
+        <w:r>
+          <w:rPr>
+            <w:rStyle w:val="Hyperlink"/>
+          </w:rPr>
+          <w:t xml:space="preserve">Responsibility for validation</w:t>
+        </w:r>
+      </w:hyperlink>
+      <w:r>
+        <w:t xml:space="preserve">)</w:t>
+      </w:r>
+      <w:r>
+        <w:t xml:space="preserve"> </w:t>
+      </w:r>
+      <w:r>
+        <w:t xml:space="preserve">is necessary and not sufficient.</w:t>
+      </w:r>
+      <w:r>
+        <w:t xml:space="preserve"> </w:t>
+      </w:r>
+      <w:r>
+        <w:t xml:space="preserve">A second person (or a later pass by the author wearing a reviewer hat)</w:t>
+      </w:r>
+      <w:r>
+        <w:t xml:space="preserve"> </w:t>
+      </w:r>
+      <w:r>
+        <w:t xml:space="preserve">should still try to break the work.</w:t>
+      </w:r>
+    </w:p>
+    <w:p>
+      <w:pPr>
+        <w:pStyle w:val="BodyText"/>
+      </w:pPr>
+      <w:r>
+        <w:t xml:space="preserve">Automated review is a filter, not a substitute for this stance.</w:t>
+      </w:r>
+      <w:r>
+        <w:t xml:space="preserve"> </w:t>
+      </w:r>
+      <w:r>
+        <w:t xml:space="preserve">Those tools miss domain errors and sometimes invent findings;</w:t>
+      </w:r>
+      <w:r>
+        <w:t xml:space="preserve"> </w:t>
+      </w:r>
+      <w:r>
+        <w:t xml:space="preserve">they do not license a lighter human review.</w:t>
+      </w:r>
+    </w:p>
+    <w:bookmarkEnd w:id="46"/>
+    <w:bookmarkStart w:id="48" w:name="references"/>
+    <w:p>
+      <w:pPr>
+        <w:pStyle w:val="Heading1"/>
+      </w:pPr>
+      <w:r>
         <w:t xml:space="preserve">References</w:t>
       </w:r>
     </w:p>
-    <w:bookmarkStart w:id="45" w:name="refs"/>
-    <w:bookmarkEnd w:id="45"/>
-    <w:bookmarkEnd w:id="46"/>
+    <w:bookmarkStart w:id="47" w:name="refs"/>
+    <w:bookmarkEnd w:id="47"/>
+    <w:bookmarkEnd w:id="48"/>
     <w:sectPr>
       <w:footnotePr>
         <w:numRestart w:val="eachSect"/>
@@ -29790,6 +29970,9 @@
     <w:abstractNumId w:val="991"/>
   </w:num>
   <w:num w:numId="1092">
+    <w:abstractNumId w:val="991"/>
+  </w:num>
+  <w:num w:numId="1093">
     <w:abstractNumId w:val="991"/>
   </w:num>
 </w:numbering>

</xml_diff>

<commit_message>
Deploying to gh-pages from @ Morrison-Lab/wai@1d6e59db82498b83aa7cf8f55037420cd65702de 🚀
</commit_message>
<xml_diff>
--- a/chapters/pr-workflow-with-agents.docx
+++ b/chapters/pr-workflow-with-agents.docx
@@ -15,7 +15,7 @@
         <w:pStyle w:val="Date"/>
       </w:pPr>
       <w:r>
-        <w:t xml:space="preserve">Last modified: 2026-08-29 23:08:45 (PDT)</w:t>
+        <w:t xml:space="preserve">Last modified: 2026-08-29 23:12:14 (PDT)</w:t>
       </w:r>
     </w:p>
     <w:p>
@@ -40314,18 +40314,157 @@
       </w:r>
     </w:p>
     <w:bookmarkEnd w:id="59"/>
-    <w:bookmarkStart w:id="61" w:name="references"/>
+    <w:bookmarkStart w:id="62" w:name="sec-autofix-pr"/>
     <w:p>
       <w:pPr>
         <w:pStyle w:val="Heading1"/>
       </w:pPr>
       <w:r>
+        <w:t xml:space="preserve">8. Auto-fix PRs with Claude Code</w:t>
+      </w:r>
+    </w:p>
+    <w:p>
+      <w:pPr>
+        <w:pStyle w:val="FirstParagraph"/>
+      </w:pPr>
+      <w:hyperlink r:id="rId60">
+        <w:r>
+          <w:rPr>
+            <w:rStyle w:val="Hyperlink"/>
+          </w:rPr>
+          <w:t xml:space="preserve">Claude Code’s</w:t>
+        </w:r>
+        <w:r>
+          <w:rPr>
+            <w:rStyle w:val="Hyperlink"/>
+          </w:rPr>
+          <w:t xml:space="preserve"> </w:t>
+        </w:r>
+        <w:r>
+          <w:rPr>
+            <w:rStyle w:val="VerbatimChar"/>
+          </w:rPr>
+          <w:t xml:space="preserve">/autofix-pr</w:t>
+        </w:r>
+      </w:hyperlink>
+      <w:r>
+        <w:t xml:space="preserve"> </w:t>
+      </w:r>
+      <w:r>
+        <w:t xml:space="preserve">watches the current branch’s pull request from Claude Code on the web</w:t>
+      </w:r>
+      <w:r>
+        <w:t xml:space="preserve"> </w:t>
+      </w:r>
+      <w:r>
+        <w:t xml:space="preserve">and pushes fixes when CI fails or reviewers leave comments.</w:t>
+      </w:r>
+      <w:r>
+        <w:t xml:space="preserve"> </w:t>
+      </w:r>
+      <w:r>
+        <w:t xml:space="preserve">It detects the open PR from your checked-out branch via</w:t>
+      </w:r>
+      <w:r>
+        <w:t xml:space="preserve"> </w:t>
+      </w:r>
+      <w:r>
+        <w:rPr>
+          <w:rStyle w:val="VerbatimChar"/>
+        </w:rPr>
+        <w:t xml:space="preserve">gh pr view</w:t>
+      </w:r>
+      <w:r>
+        <w:t xml:space="preserve">;</w:t>
+      </w:r>
+      <w:r>
+        <w:t xml:space="preserve"> </w:t>
+      </w:r>
+      <w:r>
+        <w:t xml:space="preserve">to watch a different PR, check out its branch first.</w:t>
+      </w:r>
+      <w:r>
+        <w:t xml:space="preserve"> </w:t>
+      </w:r>
+      <w:r>
+        <w:t xml:space="preserve">By default it fixes every CI failure and review comment;</w:t>
+      </w:r>
+      <w:r>
+        <w:t xml:space="preserve"> </w:t>
+      </w:r>
+      <w:r>
+        <w:t xml:space="preserve">pass a prompt to scope it, for example</w:t>
+      </w:r>
+      <w:r>
+        <w:t xml:space="preserve"> </w:t>
+      </w:r>
+      <w:r>
+        <w:rPr>
+          <w:rStyle w:val="VerbatimChar"/>
+        </w:rPr>
+        <w:t xml:space="preserve">/autofix-pr only fix lint and type errors</w:t>
+      </w:r>
+      <w:r>
+        <w:t xml:space="preserve">.</w:t>
+      </w:r>
+      <w:r>
+        <w:t xml:space="preserve"> </w:t>
+      </w:r>
+      <w:r>
+        <w:t xml:space="preserve">It requires the</w:t>
+      </w:r>
+      <w:r>
+        <w:t xml:space="preserve"> </w:t>
+      </w:r>
+      <w:r>
+        <w:rPr>
+          <w:rStyle w:val="VerbatimChar"/>
+        </w:rPr>
+        <w:t xml:space="preserve">gh</w:t>
+      </w:r>
+      <w:r>
+        <w:t xml:space="preserve"> </w:t>
+      </w:r>
+      <w:r>
+        <w:t xml:space="preserve">CLI and access to Claude Code on the web.</w:t>
+      </w:r>
+      <w:r>
+        <w:t xml:space="preserve"> </w:t>
+      </w:r>
+      <w:r>
+        <w:t xml:space="preserve">A Marketplace action at</w:t>
+      </w:r>
+      <w:r>
+        <w:t xml:space="preserve"> </w:t>
+      </w:r>
+      <w:hyperlink r:id="rId61">
+        <w:r>
+          <w:rPr>
+            <w:rStyle w:val="Hyperlink"/>
+          </w:rPr>
+          <w:t xml:space="preserve">pr-autofix-with-claude-code</w:t>
+        </w:r>
+      </w:hyperlink>
+      <w:r>
+        <w:t xml:space="preserve"> </w:t>
+      </w:r>
+      <w:r>
+        <w:t xml:space="preserve">offers the same capability as a GitHub Action.</w:t>
+      </w:r>
+    </w:p>
+    <w:bookmarkEnd w:id="62"/>
+    <w:bookmarkStart w:id="64" w:name="references"/>
+    <w:p>
+      <w:pPr>
+        <w:pStyle w:val="Heading1"/>
+      </w:pPr>
+      <w:r>
         <w:t xml:space="preserve">References</w:t>
       </w:r>
     </w:p>
-    <w:bookmarkStart w:id="60" w:name="refs"/>
-    <w:bookmarkEnd w:id="60"/>
-    <w:bookmarkEnd w:id="61"/>
+    <w:bookmarkStart w:id="63" w:name="refs"/>
+    <w:bookmarkEnd w:id="63"/>
+    <w:bookmarkEnd w:id="64"/>
     <w:sectPr>
       <w:footnotePr>
         <w:numRestart w:val="eachSect"/>

</xml_diff>